<commit_message>
docs: add patent filing information to Patent folder and project report
Co-authored-by: Rithik-sharma12 <89332289+Rithik-sharma12@users.noreply.github.com>
Agent-Logs-Url: https://github.com/Rithik-sharma12/Secure_OTA_Update_Security_Mechanism/sessions/de1ac6d2-d78f-4aaf-a651-780236830d0e
</commit_message>
<xml_diff>
--- a/FINAL_OTA_TODAY.docx
+++ b/FINAL_OTA_TODAY.docx
@@ -30336,6 +30336,187 @@
           <w14:ligatures w14:val="none"/>
         </w:rPr>
       </w:pPr>
+    </w:p>
+    <w:p>
+      <w:r>
+        <w:br w:type="page"/>
+      </w:r>
+    </w:p>
+    <w:p>
+      <w:pPr>
+        <w:pStyle w:val="Heading1"/>
+      </w:pPr>
+      <w:r>
+        <w:t>PATENT FILING INFORMATION</w:t>
+      </w:r>
+    </w:p>
+    <w:p>
+      <w:r>
+        <w:t>Project / Invention Title: Secure Heterogeneous OTA Update Mechanism</w:t>
+      </w:r>
+    </w:p>
+    <w:p>
+      <w:r>
+        <w:t>Proposed Patent Title: Secure Heterogeneous Over-The-Air (OTA) Update Security Mechanism for IoT Devices</w:t>
+      </w:r>
+    </w:p>
+    <w:p>
+      <w:r>
+        <w:t>Inventors / Student Contributors: Priyankaa Devi S (9123128034), Ritesh V (9123128039), Rithik Sharma A (9123128040)</w:t>
+      </w:r>
+    </w:p>
+    <w:p>
+      <w:r>
+        <w:t>Institution: KCG College of Technology, Karapakkam, Chennai</w:t>
+      </w:r>
+    </w:p>
+    <w:p>
+      <w:r>
+        <w:t>Suggested Filing Type: Indian Provisional Patent Application</w:t>
+      </w:r>
+    </w:p>
+    <w:p>
+      <w:pPr>
+        <w:pStyle w:val="Heading2"/>
+      </w:pPr>
+      <w:r>
+        <w:t>Technical Field</w:t>
+      </w:r>
+    </w:p>
+    <w:p>
+      <w:r>
+        <w:t>Cyber Security, IoT Security, and secure firmware Over-The-Air (OTA) update mechanisms.</w:t>
+      </w:r>
+    </w:p>
+    <w:p>
+      <w:pPr>
+        <w:pStyle w:val="Heading2"/>
+      </w:pPr>
+      <w:r>
+        <w:t>Problem Addressed</w:t>
+      </w:r>
+    </w:p>
+    <w:p>
+      <w:r>
+        <w:t>Existing OTA systems in heterogeneous IoT deployments are exposed to tampering, replay, rollback, and trust verification inconsistencies across different device classes.</w:t>
+      </w:r>
+    </w:p>
+    <w:p>
+      <w:pPr>
+        <w:pStyle w:val="Heading2"/>
+      </w:pPr>
+      <w:r>
+        <w:t>Core Inventive Concept</w:t>
+      </w:r>
+    </w:p>
+    <w:p>
+      <w:r>
+        <w:t>A secure OTA framework for heterogeneous IoT hardware that combines signed firmware distribution, encrypted transport, device identity attestation, integrity verification, and anti-rollback protection.</w:t>
+      </w:r>
+    </w:p>
+    <w:p>
+      <w:pPr>
+        <w:pStyle w:val="Heading2"/>
+      </w:pPr>
+      <w:r>
+        <w:t>Draft Claim Pointers</w:t>
+      </w:r>
+    </w:p>
+    <w:p>
+      <w:r>
+        <w:t>1. Heterogeneous-device compatible secure OTA orchestration architecture.</w:t>
+      </w:r>
+    </w:p>
+    <w:p>
+      <w:r>
+        <w:t>2. Multi-stage authenticity verification prior to firmware installation.</w:t>
+      </w:r>
+    </w:p>
+    <w:p>
+      <w:r>
+        <w:t>3. Cryptographically enforced anti-rollback with version integrity binding.</w:t>
+      </w:r>
+    </w:p>
+    <w:p>
+      <w:r>
+        <w:t>4. Signed package trust-chain validation for firmware delivery and activation.</w:t>
+      </w:r>
+    </w:p>
+    <w:p>
+      <w:r>
+        <w:t>5. Secure recovery/fallback mechanism after failed or untrusted updates.</w:t>
+      </w:r>
+    </w:p>
+    <w:p>
+      <w:pPr>
+        <w:pStyle w:val="Heading2"/>
+      </w:pPr>
+      <w:r>
+        <w:t>Indian Patent Form Mapping</w:t>
+      </w:r>
+    </w:p>
+    <w:p>
+      <w:r>
+        <w:t>- Form 1: Application for Grant of Patent</w:t>
+      </w:r>
+    </w:p>
+    <w:p>
+      <w:r>
+        <w:t>- Form 2: Provisional/Complete Specification</w:t>
+      </w:r>
+    </w:p>
+    <w:p>
+      <w:r>
+        <w:t>- Form 3: Statement and Undertaking</w:t>
+      </w:r>
+    </w:p>
+    <w:p>
+      <w:r>
+        <w:t>- Form 5: Declaration as to Inventorship</w:t>
+      </w:r>
+    </w:p>
+    <w:p>
+      <w:r>
+        <w:t>- Form 9: Request for Publication</w:t>
+      </w:r>
+    </w:p>
+    <w:p>
+      <w:r>
+        <w:t>- Form 18: Request for Examination</w:t>
+      </w:r>
+    </w:p>
+    <w:p>
+      <w:r>
+        <w:t>- Form 28: Startup/Small Entity declaration (if applicable)</w:t>
+      </w:r>
+    </w:p>
+    <w:p>
+      <w:pPr>
+        <w:pStyle w:val="Heading2"/>
+      </w:pPr>
+      <w:r>
+        <w:t>Prepared Filing Inputs</w:t>
+      </w:r>
+    </w:p>
+    <w:p>
+      <w:r>
+        <w:t>- Finalized invention title and technical abstract</w:t>
+      </w:r>
+    </w:p>
+    <w:p>
+      <w:r>
+        <w:t>- Inventor details and institutional affiliation</w:t>
+      </w:r>
+    </w:p>
+    <w:p>
+      <w:r>
+        <w:t>- Draft novelty points and claim directions</w:t>
+      </w:r>
+    </w:p>
+    <w:p>
+      <w:r>
+        <w:t>- Form mapping for filing workflow</w:t>
+      </w:r>
     </w:p>
     <w:sectPr>
       <w:headerReference w:type="default" r:id="rId20"/>

</xml_diff>

<commit_message>
feat: finalize OTA IDE runtime and ESP32 firmware workflow
</commit_message>
<xml_diff>
--- a/FINAL_OTA_TODAY.docx
+++ b/FINAL_OTA_TODAY.docx
@@ -137,7 +137,25 @@
           <w:sz w:val="32"/>
           <w:szCs w:val="32"/>
         </w:rPr>
-        <w:t xml:space="preserve"> REPORT</w:t>
+        <w:t xml:space="preserve"> </w:t>
+      </w:r>
+      <w:r>
+        <w:rPr>
+          <w:rFonts w:ascii="Times New Roman" w:eastAsia="Times New Roman" w:hAnsi="Times New Roman" w:cs="Times New Roman"/>
+          <w:b/>
+          <w:sz w:val="32"/>
+          <w:szCs w:val="32"/>
+        </w:rPr>
+        <w:t xml:space="preserve">PHASE I </w:t>
+      </w:r>
+      <w:r>
+        <w:rPr>
+          <w:rFonts w:ascii="Times New Roman" w:eastAsia="Times New Roman" w:hAnsi="Times New Roman" w:cs="Times New Roman"/>
+          <w:b/>
+          <w:sz w:val="32"/>
+          <w:szCs w:val="32"/>
+        </w:rPr>
+        <w:t>REPORT</w:t>
       </w:r>
     </w:p>
     <w:p>
@@ -730,16 +748,7 @@
           <w:b/>
           <w:sz w:val="28"/>
         </w:rPr>
-        <w:t xml:space="preserve"> RITESH V (9123128039), RITHIK SHARMA A (9123128040</w:t>
-      </w:r>
-      <w:proofErr w:type="gramStart"/>
-      <w:r>
-        <w:rPr>
-          <w:rFonts w:ascii="Times New Roman" w:hAnsi="Times New Roman" w:cs="Times New Roman"/>
-          <w:b/>
-          <w:sz w:val="28"/>
-        </w:rPr>
-        <w:t xml:space="preserve">), </w:t>
+        <w:t xml:space="preserve"> RITESH V (9123128039), RITHIK SHARMA A (9123128040), </w:t>
       </w:r>
       <w:r>
         <w:rPr>
@@ -757,7 +766,6 @@
         </w:rPr>
         <w:t>who</w:t>
       </w:r>
-      <w:proofErr w:type="gramEnd"/>
       <w:r>
         <w:rPr>
           <w:rFonts w:ascii="Times New Roman" w:hAnsi="Times New Roman" w:cs="Times New Roman"/>
@@ -931,7 +939,23 @@
           <w:b/>
           <w:sz w:val="28"/>
         </w:rPr>
-        <w:t>23CB523 and MINI PROJECT.</w:t>
+        <w:t>23</w:t>
+      </w:r>
+      <w:r>
+        <w:rPr>
+          <w:rFonts w:ascii="Times New Roman" w:hAnsi="Times New Roman" w:cs="Times New Roman"/>
+          <w:b/>
+          <w:sz w:val="28"/>
+        </w:rPr>
+        <w:t>CB621</w:t>
+      </w:r>
+      <w:r>
+        <w:rPr>
+          <w:rFonts w:ascii="Times New Roman" w:hAnsi="Times New Roman" w:cs="Times New Roman"/>
+          <w:b/>
+          <w:sz w:val="28"/>
+        </w:rPr>
+        <w:t xml:space="preserve"> and MINI PROJECT.</w:t>
       </w:r>
     </w:p>
     <w:p>
@@ -1354,7 +1378,6 @@
         </w:rPr>
         <w:t xml:space="preserve"> </w:t>
       </w:r>
-      <w:proofErr w:type="gramStart"/>
       <w:r>
         <w:rPr>
           <w:rFonts w:ascii="Times New Roman" w:hAnsi="Times New Roman" w:cs="Times New Roman"/>
@@ -1368,15 +1391,7 @@
           <w:rFonts w:ascii="Times New Roman" w:hAnsi="Times New Roman" w:cs="Times New Roman"/>
           <w:sz w:val="26"/>
         </w:rPr>
-        <w:t xml:space="preserve">   </w:t>
-      </w:r>
-      <w:proofErr w:type="gramEnd"/>
-      <w:r>
-        <w:rPr>
-          <w:rFonts w:ascii="Times New Roman" w:hAnsi="Times New Roman" w:cs="Times New Roman"/>
-          <w:sz w:val="26"/>
-        </w:rPr>
-        <w:t xml:space="preserve">                                                 </w:t>
+        <w:t xml:space="preserve">                                                    </w:t>
       </w:r>
       <w:r>
         <w:rPr>
@@ -4591,7 +4606,6 @@
               <w:t>Table 4.1 Manifest File Structure (</w:t>
             </w:r>
             <w:proofErr w:type="spellStart"/>
-            <w:proofErr w:type="gramStart"/>
             <w:r>
               <w:rPr>
                 <w:rFonts w:ascii="Times New Roman" w:eastAsia="MS Mincho" w:hAnsi="Times New Roman" w:cs="Times New Roman"/>
@@ -4602,7 +4616,6 @@
               <w:t>manifest.json</w:t>
             </w:r>
             <w:proofErr w:type="spellEnd"/>
-            <w:proofErr w:type="gramEnd"/>
             <w:r>
               <w:rPr>
                 <w:rFonts w:ascii="Times New Roman" w:eastAsia="MS Mincho" w:hAnsi="Times New Roman" w:cs="Times New Roman"/>
@@ -4876,27 +4889,7 @@
                 <w:lang w:eastAsia="en-US"/>
                 <w14:ligatures w14:val="none"/>
               </w:rPr>
-              <w:t xml:space="preserve">Figure </w:t>
-            </w:r>
-            <w:proofErr w:type="gramStart"/>
-            <w:r>
-              <w:rPr>
-                <w:rFonts w:ascii="Times New Roman" w:eastAsia="MS Mincho" w:hAnsi="Times New Roman" w:cs="Times New Roman"/>
-                <w:kern w:val="0"/>
-                <w:lang w:eastAsia="en-US"/>
-                <w14:ligatures w14:val="none"/>
-              </w:rPr>
-              <w:t>1.1  The</w:t>
-            </w:r>
-            <w:proofErr w:type="gramEnd"/>
-            <w:r>
-              <w:rPr>
-                <w:rFonts w:ascii="Times New Roman" w:eastAsia="MS Mincho" w:hAnsi="Times New Roman" w:cs="Times New Roman"/>
-                <w:kern w:val="0"/>
-                <w:lang w:eastAsia="en-US"/>
-                <w14:ligatures w14:val="none"/>
-              </w:rPr>
-              <w:t xml:space="preserve"> Three Core Failure Modes in Existing IoT OTA Systems</w:t>
+              <w:t>Figure 1.1  The Three Core Failure Modes in Existing IoT OTA Systems</w:t>
             </w:r>
           </w:p>
         </w:tc>
@@ -4923,27 +4916,7 @@
                 <w:lang w:eastAsia="en-US"/>
                 <w14:ligatures w14:val="none"/>
               </w:rPr>
-              <w:t xml:space="preserve">Figure </w:t>
-            </w:r>
-            <w:proofErr w:type="gramStart"/>
-            <w:r>
-              <w:rPr>
-                <w:rFonts w:ascii="Times New Roman" w:eastAsia="MS Mincho" w:hAnsi="Times New Roman" w:cs="Times New Roman"/>
-                <w:kern w:val="0"/>
-                <w:lang w:eastAsia="en-US"/>
-                <w14:ligatures w14:val="none"/>
-              </w:rPr>
-              <w:t>3.1  Problem</w:t>
-            </w:r>
-            <w:proofErr w:type="gramEnd"/>
-            <w:r>
-              <w:rPr>
-                <w:rFonts w:ascii="Times New Roman" w:eastAsia="MS Mincho" w:hAnsi="Times New Roman" w:cs="Times New Roman"/>
-                <w:kern w:val="0"/>
-                <w:lang w:eastAsia="en-US"/>
-                <w14:ligatures w14:val="none"/>
-              </w:rPr>
-              <w:t xml:space="preserve"> Space: Cost, Memory, and Procedural Failures Mapped to Solutions</w:t>
+              <w:t>Figure 3.1  Problem Space: Cost, Memory, and Procedural Failures Mapped to Solutions</w:t>
             </w:r>
           </w:p>
         </w:tc>
@@ -4970,27 +4943,7 @@
                 <w:lang w:eastAsia="en-US"/>
                 <w14:ligatures w14:val="none"/>
               </w:rPr>
-              <w:t xml:space="preserve">Figure </w:t>
-            </w:r>
-            <w:proofErr w:type="gramStart"/>
-            <w:r>
-              <w:rPr>
-                <w:rFonts w:ascii="Times New Roman" w:eastAsia="MS Mincho" w:hAnsi="Times New Roman" w:cs="Times New Roman"/>
-                <w:kern w:val="0"/>
-                <w:lang w:eastAsia="en-US"/>
-                <w14:ligatures w14:val="none"/>
-              </w:rPr>
-              <w:t>4.1  Overall</w:t>
-            </w:r>
-            <w:proofErr w:type="gramEnd"/>
-            <w:r>
-              <w:rPr>
-                <w:rFonts w:ascii="Times New Roman" w:eastAsia="MS Mincho" w:hAnsi="Times New Roman" w:cs="Times New Roman"/>
-                <w:kern w:val="0"/>
-                <w:lang w:eastAsia="en-US"/>
-                <w14:ligatures w14:val="none"/>
-              </w:rPr>
-              <w:t xml:space="preserve"> System Architecture: Developer, GitHub, and Device</w:t>
+              <w:t>Figure 4.1  Overall System Architecture: Developer, GitHub, and Device</w:t>
             </w:r>
           </w:p>
         </w:tc>
@@ -5017,27 +4970,7 @@
                 <w:lang w:eastAsia="en-US"/>
                 <w14:ligatures w14:val="none"/>
               </w:rPr>
-              <w:t xml:space="preserve">Figure </w:t>
-            </w:r>
-            <w:proofErr w:type="gramStart"/>
-            <w:r>
-              <w:rPr>
-                <w:rFonts w:ascii="Times New Roman" w:eastAsia="MS Mincho" w:hAnsi="Times New Roman" w:cs="Times New Roman"/>
-                <w:kern w:val="0"/>
-                <w:lang w:eastAsia="en-US"/>
-                <w14:ligatures w14:val="none"/>
-              </w:rPr>
-              <w:t>4.2  Five</w:t>
-            </w:r>
-            <w:proofErr w:type="gramEnd"/>
-            <w:r>
-              <w:rPr>
-                <w:rFonts w:ascii="Times New Roman" w:eastAsia="MS Mincho" w:hAnsi="Times New Roman" w:cs="Times New Roman"/>
-                <w:kern w:val="0"/>
-                <w:lang w:eastAsia="en-US"/>
-                <w14:ligatures w14:val="none"/>
-              </w:rPr>
-              <w:t>-Stage Verification Pipeline Flowchart</w:t>
+              <w:t>Figure 4.2  Five-Stage Verification Pipeline Flowchart</w:t>
             </w:r>
           </w:p>
         </w:tc>
@@ -5064,27 +4997,7 @@
                 <w:lang w:eastAsia="en-US"/>
                 <w14:ligatures w14:val="none"/>
               </w:rPr>
-              <w:t xml:space="preserve">Figure </w:t>
-            </w:r>
-            <w:proofErr w:type="gramStart"/>
-            <w:r>
-              <w:rPr>
-                <w:rFonts w:ascii="Times New Roman" w:eastAsia="MS Mincho" w:hAnsi="Times New Roman" w:cs="Times New Roman"/>
-                <w:kern w:val="0"/>
-                <w:lang w:eastAsia="en-US"/>
-                <w14:ligatures w14:val="none"/>
-              </w:rPr>
-              <w:t>4.3  Anomaly</w:t>
-            </w:r>
-            <w:proofErr w:type="gramEnd"/>
-            <w:r>
-              <w:rPr>
-                <w:rFonts w:ascii="Times New Roman" w:eastAsia="MS Mincho" w:hAnsi="Times New Roman" w:cs="Times New Roman"/>
-                <w:kern w:val="0"/>
-                <w:lang w:eastAsia="en-US"/>
-                <w14:ligatures w14:val="none"/>
-              </w:rPr>
-              <w:t>-Scored Heartbeat State Transitions</w:t>
+              <w:t>Figure 4.3  Anomaly-Scored Heartbeat State Transitions</w:t>
             </w:r>
           </w:p>
         </w:tc>
@@ -5111,27 +5024,7 @@
                 <w:lang w:eastAsia="en-US"/>
                 <w14:ligatures w14:val="none"/>
               </w:rPr>
-              <w:t xml:space="preserve">Figure </w:t>
-            </w:r>
-            <w:proofErr w:type="gramStart"/>
-            <w:r>
-              <w:rPr>
-                <w:rFonts w:ascii="Times New Roman" w:eastAsia="MS Mincho" w:hAnsi="Times New Roman" w:cs="Times New Roman"/>
-                <w:kern w:val="0"/>
-                <w:lang w:eastAsia="en-US"/>
-                <w14:ligatures w14:val="none"/>
-              </w:rPr>
-              <w:t>4.4  Non</w:t>
-            </w:r>
-            <w:proofErr w:type="gramEnd"/>
-            <w:r>
-              <w:rPr>
-                <w:rFonts w:ascii="Times New Roman" w:eastAsia="MS Mincho" w:hAnsi="Times New Roman" w:cs="Times New Roman"/>
-                <w:kern w:val="0"/>
-                <w:lang w:eastAsia="en-US"/>
-                <w14:ligatures w14:val="none"/>
-              </w:rPr>
-              <w:t>-Volatile Storage Write Sequence and Safe Fallback Logic</w:t>
+              <w:t>Figure 4.4  Non-Volatile Storage Write Sequence and Safe Fallback Logic</w:t>
             </w:r>
           </w:p>
         </w:tc>
@@ -5158,27 +5051,7 @@
                 <w:lang w:eastAsia="en-US"/>
                 <w14:ligatures w14:val="none"/>
               </w:rPr>
-              <w:t xml:space="preserve">Figure </w:t>
-            </w:r>
-            <w:proofErr w:type="gramStart"/>
-            <w:r>
-              <w:rPr>
-                <w:rFonts w:ascii="Times New Roman" w:eastAsia="MS Mincho" w:hAnsi="Times New Roman" w:cs="Times New Roman"/>
-                <w:kern w:val="0"/>
-                <w:lang w:eastAsia="en-US"/>
-                <w14:ligatures w14:val="none"/>
-              </w:rPr>
-              <w:t>4.5  Core</w:t>
-            </w:r>
-            <w:proofErr w:type="gramEnd"/>
-            <w:r>
-              <w:rPr>
-                <w:rFonts w:ascii="Times New Roman" w:eastAsia="MS Mincho" w:hAnsi="Times New Roman" w:cs="Times New Roman"/>
-                <w:kern w:val="0"/>
-                <w:lang w:eastAsia="en-US"/>
-                <w14:ligatures w14:val="none"/>
-              </w:rPr>
-              <w:t xml:space="preserve"> Update Algorithm Flowchart</w:t>
+              <w:t>Figure 4.5  Core Update Algorithm Flowchart</w:t>
             </w:r>
           </w:p>
         </w:tc>
@@ -5205,27 +5078,7 @@
                 <w:lang w:eastAsia="en-US"/>
                 <w14:ligatures w14:val="none"/>
               </w:rPr>
-              <w:t xml:space="preserve">Figure </w:t>
-            </w:r>
-            <w:proofErr w:type="gramStart"/>
-            <w:r>
-              <w:rPr>
-                <w:rFonts w:ascii="Times New Roman" w:eastAsia="MS Mincho" w:hAnsi="Times New Roman" w:cs="Times New Roman"/>
-                <w:kern w:val="0"/>
-                <w:lang w:eastAsia="en-US"/>
-                <w14:ligatures w14:val="none"/>
-              </w:rPr>
-              <w:t>6.1  Memory</w:t>
-            </w:r>
-            <w:proofErr w:type="gramEnd"/>
-            <w:r>
-              <w:rPr>
-                <w:rFonts w:ascii="Times New Roman" w:eastAsia="MS Mincho" w:hAnsi="Times New Roman" w:cs="Times New Roman"/>
-                <w:kern w:val="0"/>
-                <w:lang w:eastAsia="en-US"/>
-                <w14:ligatures w14:val="none"/>
-              </w:rPr>
-              <w:t xml:space="preserve"> Usage by Stage on ESP8266</w:t>
+              <w:t>Figure 6.1  Memory Usage by Stage on ESP8266</w:t>
             </w:r>
           </w:p>
         </w:tc>
@@ -7083,27 +6936,7 @@
           <w14:ligatures w14:val="none"/>
         </w:rPr>
         <w:lastRenderedPageBreak/>
-        <w:t xml:space="preserve">A significant portion of the relevant literature focuses on MQTT as the transport layer for both OTA updates and general IoT communication. Wang and Chien [6] correctly identified that MQTT-based OTA systems implicitly trust the broker, meaning a compromised broker has access to all firmware data in transit. Their formally verified end-to-end secured scheme addresses this gap, though it has not been tested against commercial IoT platforms. </w:t>
-      </w:r>
-      <w:proofErr w:type="spellStart"/>
-      <w:r>
-        <w:rPr>
-          <w:rFonts w:ascii="Times New Roman" w:eastAsia="MS Mincho" w:hAnsi="Times New Roman" w:cs="Times New Roman"/>
-          <w:kern w:val="0"/>
-          <w:lang w:eastAsia="en-US"/>
-          <w14:ligatures w14:val="none"/>
-        </w:rPr>
-        <w:t>Sahlmann</w:t>
-      </w:r>
-      <w:proofErr w:type="spellEnd"/>
-      <w:r>
-        <w:rPr>
-          <w:rFonts w:ascii="Times New Roman" w:eastAsia="MS Mincho" w:hAnsi="Times New Roman" w:cs="Times New Roman"/>
-          <w:kern w:val="0"/>
-          <w:lang w:eastAsia="en-US"/>
-          <w14:ligatures w14:val="none"/>
-        </w:rPr>
-        <w:t xml:space="preserve"> [7] proposed MUP for constrained MQTT devices with versioning and replay protection, which is probably the most practically minded of the MQTT OTA papers, though bootstrap key distribution is assumed rather than solved. Chien and Wang [8] extended this to MQTT 5.0 with an inner secure channel that protects data beyond the broker, and Luqman [9] confirmed empirically that standard TLS consumes approximately four times more energy than unencrypted MQTT on ESP32, which provides concrete justification for seeking lighter alternatives. Shin and Jeon [16] proposed </w:t>
+        <w:t xml:space="preserve">A significant portion of the relevant literature focuses on MQTT as the transport layer for both OTA updates and general IoT communication. Wang and Chien [6] correctly identified that MQTT-based OTA systems implicitly trust the broker, meaning a compromised broker has access to all firmware data in transit. Their formally verified end-to-end secured scheme addresses this gap, though it has not been tested against commercial IoT platforms. Sahlmann [7] proposed MUP for constrained MQTT devices with versioning and replay protection, which is probably the most practically minded of the MQTT OTA papers, though bootstrap key distribution is assumed rather than solved. Chien and Wang [8] extended this to MQTT 5.0 with an inner secure channel that protects data beyond the broker, and Luqman [9] confirmed empirically that standard TLS consumes approximately four times more energy than unencrypted MQTT on ESP32, which provides concrete justification for seeking lighter alternatives. Shin and Jeon [16] proposed </w:t>
       </w:r>
       <w:proofErr w:type="spellStart"/>
       <w:r>
@@ -8738,25 +8571,14 @@
                 <w14:ligatures w14:val="none"/>
               </w:rPr>
             </w:pPr>
-            <w:proofErr w:type="spellStart"/>
-            <w:r>
-              <w:rPr>
-                <w:rFonts w:ascii="Times New Roman" w:eastAsia="MS Mincho" w:hAnsi="Times New Roman" w:cs="Times New Roman"/>
-                <w:kern w:val="0"/>
-                <w:lang w:eastAsia="en-US"/>
-                <w14:ligatures w14:val="none"/>
-              </w:rPr>
-              <w:t>Cleber</w:t>
-            </w:r>
-            <w:proofErr w:type="spellEnd"/>
-            <w:r>
-              <w:rPr>
-                <w:rFonts w:ascii="Times New Roman" w:eastAsia="MS Mincho" w:hAnsi="Times New Roman" w:cs="Times New Roman"/>
-                <w:kern w:val="0"/>
-                <w:lang w:eastAsia="en-US"/>
-                <w14:ligatures w14:val="none"/>
-              </w:rPr>
-              <w:t xml:space="preserve"> S. Peter</w:t>
+            <w:r>
+              <w:rPr>
+                <w:rFonts w:ascii="Times New Roman" w:eastAsia="MS Mincho" w:hAnsi="Times New Roman" w:cs="Times New Roman"/>
+                <w:kern w:val="0"/>
+                <w:lang w:eastAsia="en-US"/>
+                <w14:ligatures w14:val="none"/>
+              </w:rPr>
+              <w:t>Cleber S. Peter</w:t>
             </w:r>
           </w:p>
         </w:tc>
@@ -10948,27 +10770,7 @@
           <w:lang w:eastAsia="en-US"/>
           <w14:ligatures w14:val="none"/>
         </w:rPr>
-        <w:t xml:space="preserve">The second failure is computational. The security algorithms that enterprise systems use for signing and verifying firmware, mostly variants of RSA, require significant working memory to run. Verifying an RSA-2048 signature requires roughly 64 KB of free RAM just for that one operation. An ATmega328P microcontroller, which is the chip at the heart of hundreds of millions of deployed IoT devices including most Arduino-compatible hardware, has exactly 2 KB of total RAM shared between the application, the networking stack, and everything else the device is doing simultaneously. RSA is not an option on that hardware under any circumstances. </w:t>
-      </w:r>
-      <w:proofErr w:type="gramStart"/>
-      <w:r>
-        <w:rPr>
-          <w:rFonts w:ascii="Times New Roman" w:eastAsia="MS Mincho" w:hAnsi="Times New Roman" w:cs="Times New Roman"/>
-          <w:kern w:val="0"/>
-          <w:lang w:eastAsia="en-US"/>
-          <w14:ligatures w14:val="none"/>
-        </w:rPr>
-        <w:t>So</w:t>
-      </w:r>
-      <w:proofErr w:type="gramEnd"/>
-      <w:r>
-        <w:rPr>
-          <w:rFonts w:ascii="Times New Roman" w:eastAsia="MS Mincho" w:hAnsi="Times New Roman" w:cs="Times New Roman"/>
-          <w:kern w:val="0"/>
-          <w:lang w:eastAsia="en-US"/>
-          <w14:ligatures w14:val="none"/>
-        </w:rPr>
-        <w:t xml:space="preserve"> developers face a choice between using more expensive, more capable hardware or using the cheap hardware and either skipping cryptographic verification entirely or using weaker alternatives that do not provide meaningful security. Neither option is acceptable.</w:t>
+        <w:t>The second failure is computational. The security algorithms that enterprise systems use for signing and verifying firmware, mostly variants of RSA, require significant working memory to run. Verifying an RSA-2048 signature requires roughly 64 KB of free RAM just for that one operation. An ATmega328P microcontroller, which is the chip at the heart of hundreds of millions of deployed IoT devices including most Arduino-compatible hardware, has exactly 2 KB of total RAM shared between the application, the networking stack, and everything else the device is doing simultaneously. RSA is not an option on that hardware under any circumstances. So developers face a choice between using more expensive, more capable hardware or using the cheap hardware and either skipping cryptographic verification entirely or using weaker alternatives that do not provide meaningful security. Neither option is acceptable.</w:t>
       </w:r>
     </w:p>
     <w:p>
@@ -12453,27 +12255,7 @@
           <w:lang w:eastAsia="en-US"/>
           <w14:ligatures w14:val="none"/>
         </w:rPr>
-        <w:t xml:space="preserve">Here are all 14 tables ready to copy and paste directly into Word. Each one is labelled with its title and the exact location where it belongs in your document. When you paste into Word, click inside the table area, select all the table text, then go to Insert &gt; Table &gt; Convert Text to Table if it does not auto-format. In most versions of </w:t>
-      </w:r>
-      <w:proofErr w:type="gramStart"/>
-      <w:r>
-        <w:rPr>
-          <w:rFonts w:ascii="Times New Roman" w:eastAsia="MS Mincho" w:hAnsi="Times New Roman" w:cs="Times New Roman"/>
-          <w:kern w:val="0"/>
-          <w:lang w:eastAsia="en-US"/>
-          <w14:ligatures w14:val="none"/>
-        </w:rPr>
-        <w:t>Word</w:t>
-      </w:r>
-      <w:proofErr w:type="gramEnd"/>
-      <w:r>
-        <w:rPr>
-          <w:rFonts w:ascii="Times New Roman" w:eastAsia="MS Mincho" w:hAnsi="Times New Roman" w:cs="Times New Roman"/>
-          <w:kern w:val="0"/>
-          <w:lang w:eastAsia="en-US"/>
-          <w14:ligatures w14:val="none"/>
-        </w:rPr>
-        <w:t xml:space="preserve"> it will recognise the table structure automatically on paste.</w:t>
+        <w:t>Here are all 14 tables ready to copy and paste directly into Word. Each one is labelled with its title and the exact location where it belongs in your document. When you paste into Word, click inside the table area, select all the table text, then go to Insert &gt; Table &gt; Convert Text to Table if it does not auto-format. In most versions of Word it will recognise the table structure automatically on paste.</w:t>
       </w:r>
     </w:p>
     <w:p>
@@ -13130,27 +12912,7 @@
                 <w:lang w:eastAsia="en-US"/>
                 <w14:ligatures w14:val="none"/>
               </w:rPr>
-              <w:t xml:space="preserve">The system shall enter quarantine mode when the health score drops below 40 and </w:t>
-            </w:r>
-            <w:proofErr w:type="gramStart"/>
-            <w:r>
-              <w:rPr>
-                <w:rFonts w:ascii="Times New Roman" w:eastAsia="MS Mincho" w:hAnsi="Times New Roman" w:cs="Times New Roman"/>
-                <w:kern w:val="0"/>
-                <w:lang w:eastAsia="en-US"/>
-                <w14:ligatures w14:val="none"/>
-              </w:rPr>
-              <w:t>stop</w:t>
-            </w:r>
-            <w:proofErr w:type="gramEnd"/>
-            <w:r>
-              <w:rPr>
-                <w:rFonts w:ascii="Times New Roman" w:eastAsia="MS Mincho" w:hAnsi="Times New Roman" w:cs="Times New Roman"/>
-                <w:kern w:val="0"/>
-                <w:lang w:eastAsia="en-US"/>
-                <w14:ligatures w14:val="none"/>
-              </w:rPr>
-              <w:t xml:space="preserve"> accepting updates until an operator manually resets the score</w:t>
+              <w:t>The system shall enter quarantine mode when the health score drops below 40 and stop accepting updates until an operator manually resets the score</w:t>
             </w:r>
           </w:p>
         </w:tc>
@@ -18043,27 +17805,7 @@
           <w:lang w:eastAsia="en-US"/>
           <w14:ligatures w14:val="none"/>
         </w:rPr>
-        <w:t xml:space="preserve">The device queries this API by making a single HTTPS GET request to the URL formed by combining the fixed API base address with the repository owner name and repository name. The response is a JSON object that the device parses to extract two pieces of information: the tag name, which becomes the candidate version for comparison, and the list of </w:t>
-      </w:r>
-      <w:proofErr w:type="gramStart"/>
-      <w:r>
-        <w:rPr>
-          <w:rFonts w:ascii="Times New Roman" w:eastAsia="MS Mincho" w:hAnsi="Times New Roman" w:cs="Times New Roman"/>
-          <w:kern w:val="0"/>
-          <w:lang w:eastAsia="en-US"/>
-          <w14:ligatures w14:val="none"/>
-        </w:rPr>
-        <w:t>asset</w:t>
-      </w:r>
-      <w:proofErr w:type="gramEnd"/>
-      <w:r>
-        <w:rPr>
-          <w:rFonts w:ascii="Times New Roman" w:eastAsia="MS Mincho" w:hAnsi="Times New Roman" w:cs="Times New Roman"/>
-          <w:kern w:val="0"/>
-          <w:lang w:eastAsia="en-US"/>
-          <w14:ligatures w14:val="none"/>
-        </w:rPr>
-        <w:t xml:space="preserve"> download URLs, from which the device identifies the URLs for the firmware binary and the manifest file specifically.</w:t>
+        <w:t>The device queries this API by making a single HTTPS GET request to the URL formed by combining the fixed API base address with the repository owner name and repository name. The response is a JSON object that the device parses to extract two pieces of information: the tag name, which becomes the candidate version for comparison, and the list of asset download URLs, from which the device identifies the URLs for the firmware binary and the manifest file specifically.</w:t>
       </w:r>
     </w:p>
     <w:p>
@@ -18183,7 +17925,6 @@
         <w:t xml:space="preserve">The manifest file, named </w:t>
       </w:r>
       <w:proofErr w:type="spellStart"/>
-      <w:proofErr w:type="gramStart"/>
       <w:r>
         <w:rPr>
           <w:rFonts w:ascii="Times New Roman" w:eastAsia="MS Mincho" w:hAnsi="Times New Roman" w:cs="Times New Roman"/>
@@ -18194,7 +17935,6 @@
         <w:t>manifest.json</w:t>
       </w:r>
       <w:proofErr w:type="spellEnd"/>
-      <w:proofErr w:type="gramEnd"/>
       <w:r>
         <w:rPr>
           <w:rFonts w:ascii="Times New Roman" w:eastAsia="MS Mincho" w:hAnsi="Times New Roman" w:cs="Times New Roman"/>
@@ -18305,7 +18045,6 @@
         <w:t>Manifest File Structure (</w:t>
       </w:r>
       <w:proofErr w:type="spellStart"/>
-      <w:proofErr w:type="gramStart"/>
       <w:r>
         <w:rPr>
           <w:rFonts w:ascii="Times New Roman" w:eastAsia="MS Mincho" w:hAnsi="Times New Roman" w:cs="Times New Roman"/>
@@ -18316,7 +18055,6 @@
         <w:t>manifest.json</w:t>
       </w:r>
       <w:proofErr w:type="spellEnd"/>
-      <w:proofErr w:type="gramEnd"/>
       <w:r>
         <w:rPr>
           <w:rFonts w:ascii="Times New Roman" w:eastAsia="MS Mincho" w:hAnsi="Times New Roman" w:cs="Times New Roman"/>
@@ -24016,27 +23754,7 @@
           <w14:ligatures w14:val="none"/>
         </w:rPr>
         <w:lastRenderedPageBreak/>
-        <w:t xml:space="preserve">approximately 1,520 bytes. The 512-byte download buffer in stage three and the 256-byte SHA-256 streaming state are the next largest consumers. Because the stages run sequentially rather than simultaneously, these memory requirements do not all stack on top of each other, and the </w:t>
-      </w:r>
-      <w:proofErr w:type="gramStart"/>
-      <w:r>
-        <w:rPr>
-          <w:rFonts w:ascii="Times New Roman" w:eastAsia="MS Mincho" w:hAnsi="Times New Roman" w:cs="Times New Roman"/>
-          <w:kern w:val="0"/>
-          <w:lang w:eastAsia="en-US"/>
-          <w14:ligatures w14:val="none"/>
-        </w:rPr>
-        <w:t>1,847 byte</w:t>
-      </w:r>
-      <w:proofErr w:type="gramEnd"/>
-      <w:r>
-        <w:rPr>
-          <w:rFonts w:ascii="Times New Roman" w:eastAsia="MS Mincho" w:hAnsi="Times New Roman" w:cs="Times New Roman"/>
-          <w:kern w:val="0"/>
-          <w:lang w:eastAsia="en-US"/>
-          <w14:ligatures w14:val="none"/>
-        </w:rPr>
-        <w:t xml:space="preserve"> figure represents the true peak at any single instant. This is within the 2 KB target with some headroom.</w:t>
+        <w:t>approximately 1,520 bytes. The 512-byte download buffer in stage three and the 256-byte SHA-256 streaming state are the next largest consumers. Because the stages run sequentially rather than simultaneously, these memory requirements do not all stack on top of each other, and the 1,847 byte figure represents the true peak at any single instant. This is within the 2 KB target with some headroom.</w:t>
       </w:r>
     </w:p>
     <w:p>

</xml_diff>